<commit_message>
feat: Add Stakeholder Survey & OBE Analytics system, sync training/tools, and fix navigation links
</commit_message>
<xml_diff>
--- a/ข้อมูลพื้นฐาน AUN-QA-สายสนับสนุน30042569(1).docx
+++ b/ข้อมูลพื้นฐาน AUN-QA-สายสนับสนุน30042569(1).docx
@@ -47106,8 +47106,8 @@
 </file>
 
 <file path=customXml/item3.xml><?xml version="1.0" encoding="utf-8"?>
-<ct:contentTypeSchema xmlns:ct="http://schemas.microsoft.com/office/2006/metadata/contentType" xmlns:ma="http://schemas.microsoft.com/office/2006/metadata/properties/metaAttributes" ct:_="" ma:_="" ma:contentTypeName="เอกสาร" ma:contentTypeID="0x010100635C092CABE9D145A56D36AB4E2A3327" ma:contentTypeVersion="12" ma:contentTypeDescription="สร้างเอกสารใหม่" ma:contentTypeScope="" ma:versionID="8506be4bb5bea71e4cbe4610f0912fce">
-  <xsd:schema xmlns:xsd="http://www.w3.org/2001/XMLSchema" xmlns:xs="http://www.w3.org/2001/XMLSchema" xmlns:p="http://schemas.microsoft.com/office/2006/metadata/properties" xmlns:ns2="12c76430-af29-40fc-a49f-a7c3333ae551" xmlns:ns3="8e04548f-3c8c-4049-918b-e7dfc92f9aa7" targetNamespace="http://schemas.microsoft.com/office/2006/metadata/properties" ma:root="true" ma:fieldsID="3e900fa4ddd64a8a99d798e7aa271d81" ns2:_="" ns3:_="">
+<ct:contentTypeSchema xmlns:ct="http://schemas.microsoft.com/office/2006/metadata/contentType" xmlns:ma="http://schemas.microsoft.com/office/2006/metadata/properties/metaAttributes" ct:_="" ma:_="" ma:contentTypeName="Document" ma:contentTypeID="0x010100635C092CABE9D145A56D36AB4E2A3327" ma:contentTypeVersion="12" ma:contentTypeDescription="Create a new document." ma:contentTypeScope="" ma:versionID="eb71e0d993f5cca0ff19d93f245ca1c3">
+  <xsd:schema xmlns:xsd="http://www.w3.org/2001/XMLSchema" xmlns:xs="http://www.w3.org/2001/XMLSchema" xmlns:p="http://schemas.microsoft.com/office/2006/metadata/properties" xmlns:ns2="12c76430-af29-40fc-a49f-a7c3333ae551" xmlns:ns3="8e04548f-3c8c-4049-918b-e7dfc92f9aa7" targetNamespace="http://schemas.microsoft.com/office/2006/metadata/properties" ma:root="true" ma:fieldsID="ed9bd4910c5656df395b2f9fc77eeaad" ns2:_="" ns3:_="">
     <xsd:import namespace="12c76430-af29-40fc-a49f-a7c3333ae551"/>
     <xsd:import namespace="8e04548f-3c8c-4049-918b-e7dfc92f9aa7"/>
     <xsd:element name="properties">
@@ -47157,7 +47157,7 @@
         <xsd:restriction base="dms:Text"/>
       </xsd:simpleType>
     </xsd:element>
-    <xsd:element name="lcf76f155ced4ddcb4097134ff3c332f" ma:index="13" nillable="true" ma:taxonomy="true" ma:internalName="lcf76f155ced4ddcb4097134ff3c332f" ma:taxonomyFieldName="MediaServiceImageTags" ma:displayName="แท็กรูป" ma:readOnly="false" ma:fieldId="{5cf76f15-5ced-4ddc-b409-7134ff3c332f}" ma:taxonomyMulti="true" ma:sspId="b6c7b84a-44aa-44af-b0d3-89560a1c99db" ma:termSetId="09814cd3-568e-fe90-9814-8d621ff8fb84" ma:anchorId="fba54fb3-c3e1-fe81-a776-ca4b69148c4d" ma:open="true" ma:isKeyword="false">
+    <xsd:element name="lcf76f155ced4ddcb4097134ff3c332f" ma:index="13" nillable="true" ma:taxonomy="true" ma:internalName="lcf76f155ced4ddcb4097134ff3c332f" ma:taxonomyFieldName="MediaServiceImageTags" ma:displayName="Image Tags" ma:readOnly="false" ma:fieldId="{5cf76f15-5ced-4ddc-b409-7134ff3c332f}" ma:taxonomyMulti="true" ma:sspId="b6c7b84a-44aa-44af-b0d3-89560a1c99db" ma:termSetId="09814cd3-568e-fe90-9814-8d621ff8fb84" ma:anchorId="fba54fb3-c3e1-fe81-a776-ca4b69148c4d" ma:open="true" ma:isKeyword="false">
       <xsd:complexType>
         <xsd:sequence>
           <xsd:element ref="pc:Terms" minOccurs="0" maxOccurs="1"/>
@@ -47216,8 +47216,8 @@
         <xsd:element ref="dc:creator" minOccurs="0" maxOccurs="1"/>
         <xsd:element ref="dcterms:created" minOccurs="0" maxOccurs="1"/>
         <xsd:element ref="dc:identifier" minOccurs="0" maxOccurs="1"/>
-        <xsd:element name="contentType" minOccurs="0" maxOccurs="1" type="xsd:string" ma:index="0" ma:displayName="ชนิดเนื้อหา"/>
-        <xsd:element ref="dc:title" minOccurs="0" maxOccurs="1" ma:index="4" ma:displayName="ชื่อเรื่อง"/>
+        <xsd:element name="contentType" minOccurs="0" maxOccurs="1" type="xsd:string" ma:index="0" ma:displayName="Content Type"/>
+        <xsd:element ref="dc:title" minOccurs="0" maxOccurs="1" ma:index="4" ma:displayName="Title"/>
         <xsd:element ref="dc:subject" minOccurs="0" maxOccurs="1"/>
         <xsd:element ref="dc:description" minOccurs="0" maxOccurs="1"/>
         <xsd:element name="keywords" minOccurs="0" maxOccurs="1" type="xsd:string"/>
@@ -47343,7 +47343,7 @@
 </file>
 
 <file path=customXml/itemProps3.xml><?xml version="1.0" encoding="utf-8"?>
-<ds:datastoreItem xmlns:ds="http://schemas.openxmlformats.org/officeDocument/2006/customXml" ds:itemID="{818ECE34-F592-4F0B-9B85-A8D0743CC2A4}"/>
+<ds:datastoreItem xmlns:ds="http://schemas.openxmlformats.org/officeDocument/2006/customXml" ds:itemID="{18CE6BBC-9666-490B-9589-F717D96F862D}"/>
 </file>
 
 <file path=customXml/itemProps4.xml><?xml version="1.0" encoding="utf-8"?>

</xml_diff>